<commit_message>
update files in repo
</commit_message>
<xml_diff>
--- a/docs/coursework/review-2026-10-25/Progress Report 5 (Tony Tran) - Submission Candidate October 25.docx
+++ b/docs/coursework/review-2026-10-25/Progress Report 5 (Tony Tran) - Submission Candidate October 25.docx
@@ -401,7 +401,7 @@
         <w:rPr>
           <w:rFonts w:cs="Times New Roman"/>
         </w:rPr>
-        <w:t>•  Prepared the Video V outline and recording script as a final-project checkpoint. The presentation traces the progression from the initial pilot, through primary-v1, supplemental-v1, and PATH-S06, to the clean reproduction and final deliverable structure without adding a new experiment.</w:t>
+        <w:t>Prepared the Video V outline and recording script as a final-project checkpoint. The presentation traces the progression from the initial pilot, through primary-v1, supplemental-v1, and PATH-S06, to the clean reproduction and final deliverable structure without adding a new experiment. I also incorporated two Video IV peer comments into the future-work plan without changing frozen records.</w:t>
       </w:r>
     </w:p>
     <w:p>
@@ -1746,13 +1746,7 @@
         <w:rPr>
           <w:rFonts w:cs="Times New Roman"/>
         </w:rPr>
-        <w:t xml:space="preserve">•  </w:t>
-      </w:r>
-      <w:r>
-        <w:rPr>
-          <w:rFonts w:cs="Times New Roman"/>
-        </w:rPr>
-        <w:t>Summarize any substantive feedback received on FixProof with an adopt, defer, or decline disposition for the final report and presentation. Feedback is communication evidence and does not change the frozen experiment records.</w:t>
+        <w:t>Carry the two Video IV peer comments into the final report: retain the existing PATH-S06 audit trail, list a second fixture as the higher-value coverage extension, and do not describe the author-run clean rehearsal as independent reproduction. Neither comment changes frozen results.</w:t>
       </w:r>
     </w:p>
     <w:p>
@@ -1942,19 +1936,7 @@
         <w:rPr>
           <w:rFonts w:cs="Times New Roman"/>
         </w:rPr>
-        <w:t>Feedback requested: Is the distinction between a reproducible research snapshot and a production</w:t>
-      </w:r>
-      <w:r>
-        <w:rPr>
-          <w:rFonts w:cs="Times New Roman"/>
-        </w:rPr>
-        <w:t xml:space="preserve"> </w:t>
-      </w:r>
-      <w:r>
-        <w:rPr>
-          <w:rFonts w:cs="Times New Roman"/>
-        </w:rPr>
-        <w:t>ready software release clear? For the final presentation, which evidence is most persuasive: the clean reproduction, the candidate-level matrices, or a focused request/response example?</w:t>
+        <w:t>Video IV feedback did not produce consensus. One reviewer favored a second fixture because it would add application diversity; another favored an independent PATH-S06 rerun and specified source hashes, setup steps, the marker, and per-candidate responses. I adopted the audit-trail recommendation because those fields are already preserved, and I will list a second fixture as future work. A true independent rerun remains deferred unless another person performs it. For Video V, I will ask whether one focused candidate example is enough to explain the separation among validators, policy, and human judgment.</w:t>
       </w:r>
     </w:p>
     <w:p>
@@ -8344,6 +8326,7 @@
   <w:style w:type="character" w:default="1" w:styleId="DefaultParagraphFont">
     <w:name w:val="Default Paragraph Font"/>
     <w:uiPriority w:val="1"/>
+    <w:semiHidden/>
     <w:unhideWhenUsed/>
   </w:style>
   <w:style w:type="table" w:default="1" w:styleId="TableNormal">

</xml_diff>